<commit_message>
docs: add cv research section
</commit_message>
<xml_diff>
--- a/public/sebastian_boehler_cv.docx
+++ b/public/sebastian_boehler_cv.docx
@@ -36,6 +36,7 @@
     <w:p>
       <w:r>
         <w:rPr>
+          <w:rFonts w:ascii="Arial" w:hAnsi="Arial" w:eastAsia="Arial"/>
           <w:b/>
           <w:sz w:val="22"/>
         </w:rPr>
@@ -67,6 +68,7 @@
           <w:p>
             <w:r>
               <w:rPr>
+                <w:rFonts w:ascii="Arial" w:hAnsi="Arial" w:eastAsia="Arial"/>
                 <w:b/>
               </w:rPr>
               <w:t>since 10/2025</w:t>
@@ -80,32 +82,19 @@
           <w:p>
             <w:r>
               <w:rPr>
+                <w:rFonts w:ascii="Arial" w:hAnsi="Arial" w:eastAsia="Arial"/>
                 <w:b/>
               </w:rPr>
-              <w:t xml:space="preserve">M.Sc. Computer Science </w:t>
-            </w:r>
-            <w:r>
-              <w:rPr>
-                <w:b/>
-              </w:rPr>
-              <w:t>–</w:t>
-            </w:r>
-            <w:r>
-              <w:rPr>
-                <w:b/>
-              </w:rPr>
-              <w:t xml:space="preserve"> </w:t>
-            </w:r>
-            <w:r>
-              <w:rPr>
-                <w:b/>
-              </w:rPr>
-              <w:t>University of Tübingen</w:t>
+              <w:t>M.Sc. Computer Science - University of Tübingen</w:t>
             </w:r>
             <w:r>
               <w:br/>
             </w:r>
             <w:r>
+              <w:rPr>
+                <w:rFonts w:ascii="Arial" w:hAnsi="Arial" w:eastAsia="Arial"/>
+                <w:b w:val="0"/>
+              </w:rPr>
               <w:t>Deepening theoretical machine learning knowledge</w:t>
             </w:r>
           </w:p>
@@ -119,21 +108,10 @@
           <w:p>
             <w:r>
               <w:rPr>
+                <w:rFonts w:ascii="Arial" w:hAnsi="Arial" w:eastAsia="Arial"/>
                 <w:b/>
               </w:rPr>
-              <w:t>10/2024</w:t>
-            </w:r>
-            <w:r>
-              <w:rPr>
-                <w:b/>
-              </w:rPr>
-              <w:t xml:space="preserve"> - </w:t>
-            </w:r>
-            <w:r>
-              <w:rPr>
-                <w:b/>
-              </w:rPr>
-              <w:t>12/2025</w:t>
+              <w:t>10/2024 - 12/2025</w:t>
             </w:r>
           </w:p>
         </w:tc>
@@ -149,36 +127,20 @@
             </w:pPr>
             <w:r>
               <w:rPr>
+                <w:rFonts w:ascii="Arial" w:hAnsi="Arial" w:eastAsia="Arial"/>
                 <w:b/>
               </w:rPr>
-              <w:t xml:space="preserve">B.Sc. Computer Science (engl.) </w:t>
+              <w:t>B.Sc. Computer Science (English) - IU International University of Applied Sciences</w:t>
+            </w:r>
+            <w:r>
+              <w:br/>
             </w:r>
             <w:r>
               <w:rPr>
-                <w:b/>
+                <w:rFonts w:ascii="Arial" w:hAnsi="Arial" w:eastAsia="Arial"/>
+                <w:b w:val="0"/>
               </w:rPr>
-              <w:t>-</w:t>
-            </w:r>
-            <w:r>
-              <w:rPr>
-                <w:b/>
-              </w:rPr>
-              <w:t xml:space="preserve"> IU </w:t>
-            </w:r>
-            <w:r>
-              <w:rPr>
-                <w:b/>
-              </w:rPr>
-              <w:t>International University of Applied Sciences</w:t>
-            </w:r>
-            <w:r>
-              <w:rPr>
-                <w:b/>
-              </w:rPr>
-              <w:br/>
-            </w:r>
-            <w:r>
-              <w:t>Comp Science studies, finished in about a year</w:t>
+              <w:t>Computer science degree program, completed in about one year</w:t>
             </w:r>
           </w:p>
         </w:tc>
@@ -191,21 +153,10 @@
           <w:p>
             <w:r>
               <w:rPr>
+                <w:rFonts w:ascii="Arial" w:hAnsi="Arial" w:eastAsia="Arial"/>
                 <w:b/>
               </w:rPr>
-              <w:t>09/2012</w:t>
-            </w:r>
-            <w:r>
-              <w:rPr>
-                <w:b/>
-              </w:rPr>
-              <w:t xml:space="preserve"> - </w:t>
-            </w:r>
-            <w:r>
-              <w:rPr>
-                <w:b/>
-              </w:rPr>
-              <w:t>07/2020</w:t>
+              <w:t>09/2012 - 07/2020</w:t>
             </w:r>
           </w:p>
         </w:tc>
@@ -216,6 +167,7 @@
           <w:p>
             <w:r>
               <w:rPr>
+                <w:rFonts w:ascii="Arial" w:hAnsi="Arial" w:eastAsia="Arial"/>
                 <w:b/>
               </w:rPr>
               <w:t>Dietrich-Bonhoeffer-Gymnasium</w:t>
@@ -228,10 +180,11 @@
     <w:p>
       <w:r>
         <w:rPr>
+          <w:rFonts w:ascii="Arial" w:hAnsi="Arial" w:eastAsia="Arial"/>
           <w:b/>
           <w:sz w:val="22"/>
         </w:rPr>
-        <w:t>Work experience and endeavors</w:t>
+        <w:t>Work Experience &amp; Entrepreneurship</w:t>
       </w:r>
     </w:p>
     <w:tbl>
@@ -264,6 +217,7 @@
             </w:pPr>
             <w:r>
               <w:rPr>
+                <w:rFonts w:ascii="Arial" w:hAnsi="Arial" w:eastAsia="Arial"/>
                 <w:b/>
               </w:rPr>
               <w:t>since 05/2025</w:t>
@@ -280,51 +234,22 @@
                 <w:b/>
               </w:rPr>
             </w:pPr>
-            <w:proofErr w:type="spellStart"/>
             <w:r>
               <w:rPr>
+                <w:rFonts w:ascii="Arial" w:hAnsi="Arial" w:eastAsia="Arial"/>
                 <w:b/>
               </w:rPr>
-              <w:t>Sunderlabs</w:t>
-            </w:r>
-            <w:proofErr w:type="spellEnd"/>
-            <w:r>
-              <w:rPr>
-                <w:b/>
-              </w:rPr>
-              <w:t xml:space="preserve"> - Founder</w:t>
+              <w:t>Sunderlabs - Founder</w:t>
             </w:r>
             <w:r>
-              <w:rPr>
-                <w:b/>
-              </w:rPr>
               <w:br/>
             </w:r>
             <w:r>
               <w:rPr>
-                <w:bCs/>
+                <w:rFonts w:ascii="Arial" w:hAnsi="Arial" w:eastAsia="Arial"/>
+                <w:b w:val="0"/>
               </w:rPr>
-              <w:t xml:space="preserve">Reinforcement learning and </w:t>
-            </w:r>
-            <w:proofErr w:type="spellStart"/>
-            <w:r>
-              <w:rPr>
-                <w:bCs/>
-              </w:rPr>
-              <w:t>nlp</w:t>
-            </w:r>
-            <w:proofErr w:type="spellEnd"/>
-            <w:r>
-              <w:rPr>
-                <w:bCs/>
-              </w:rPr>
-              <w:t xml:space="preserve"> research</w:t>
-            </w:r>
-            <w:r>
-              <w:rPr>
-                <w:bCs/>
-              </w:rPr>
-              <w:t>, development of agentic systems</w:t>
+              <w:t>Reinforcement learning and NLP research; development of agentic systems</w:t>
             </w:r>
           </w:p>
         </w:tc>
@@ -337,6 +262,7 @@
           <w:p>
             <w:r>
               <w:rPr>
+                <w:rFonts w:ascii="Arial" w:hAnsi="Arial" w:eastAsia="Arial"/>
                 <w:b/>
               </w:rPr>
               <w:t>since 07/2023</w:t>
@@ -350,110 +276,20 @@
           <w:p>
             <w:r>
               <w:rPr>
+                <w:rFonts w:ascii="Arial" w:hAnsi="Arial" w:eastAsia="Arial"/>
                 <w:b/>
               </w:rPr>
-              <w:t xml:space="preserve">HB Capital </w:t>
-            </w:r>
-            <w:r>
-              <w:rPr>
-                <w:b/>
-              </w:rPr>
-              <w:t>-</w:t>
-            </w:r>
-            <w:r>
-              <w:rPr>
-                <w:b/>
-              </w:rPr>
-              <w:t xml:space="preserve"> </w:t>
-            </w:r>
-            <w:r>
-              <w:rPr>
-                <w:b/>
-              </w:rPr>
-              <w:t>Co-Founder</w:t>
+              <w:t>HB Capital - Co-Founder</w:t>
             </w:r>
             <w:r>
               <w:br/>
             </w:r>
             <w:r>
-              <w:t xml:space="preserve">Develop trading infrastructure, </w:t>
-            </w:r>
-            <w:proofErr w:type="spellStart"/>
-            <w:r>
-              <w:t>backtesting</w:t>
-            </w:r>
-            <w:proofErr w:type="spellEnd"/>
-            <w:r>
-              <w:t xml:space="preserve"> systems and RL </w:t>
-            </w:r>
-            <w:proofErr w:type="spellStart"/>
-            <w:r>
-              <w:t>envs</w:t>
-            </w:r>
-            <w:proofErr w:type="spellEnd"/>
-          </w:p>
-        </w:tc>
-      </w:tr>
-      <w:tr>
-        <w:tc>
-          <w:tcPr>
-            <w:tcW w:w="1000" w:type="pct"/>
-          </w:tcPr>
-          <w:p>
-            <w:r>
               <w:rPr>
-                <w:b/>
+                <w:rFonts w:ascii="Arial" w:hAnsi="Arial" w:eastAsia="Arial"/>
+                <w:b w:val="0"/>
               </w:rPr>
-              <w:t>07/2022</w:t>
-            </w:r>
-            <w:r>
-              <w:rPr>
-                <w:b/>
-              </w:rPr>
-              <w:t xml:space="preserve"> - </w:t>
-            </w:r>
-            <w:r>
-              <w:rPr>
-                <w:b/>
-              </w:rPr>
-              <w:t>07/2023</w:t>
-            </w:r>
-          </w:p>
-        </w:tc>
-        <w:tc>
-          <w:tcPr>
-            <w:tcW w:w="4000" w:type="pct"/>
-          </w:tcPr>
-          <w:p>
-            <w:r>
-              <w:rPr>
-                <w:b/>
-              </w:rPr>
-              <w:t xml:space="preserve">LI.FI </w:t>
-            </w:r>
-            <w:r>
-              <w:rPr>
-                <w:b/>
-              </w:rPr>
-              <w:t>-</w:t>
-            </w:r>
-            <w:r>
-              <w:rPr>
-                <w:b/>
-              </w:rPr>
-              <w:t xml:space="preserve"> Backend </w:t>
-            </w:r>
-            <w:r>
-              <w:rPr>
-                <w:b/>
-              </w:rPr>
-              <w:t>Developer</w:t>
-            </w:r>
-            <w:r>
-              <w:br/>
-            </w:r>
-            <w:r>
-              <w:t>Develop data connectors for on chain data</w:t>
+              <w:t>Development of trading infrastructure, backtesting systems, and RL environments</w:t>
             </w:r>
           </w:p>
         </w:tc>
@@ -466,21 +302,10 @@
           <w:p>
             <w:r>
               <w:rPr>
+                <w:rFonts w:ascii="Arial" w:hAnsi="Arial" w:eastAsia="Arial"/>
                 <w:b/>
               </w:rPr>
-              <w:t>12/2020</w:t>
-            </w:r>
-            <w:r>
-              <w:rPr>
-                <w:b/>
-              </w:rPr>
-              <w:t xml:space="preserve"> - </w:t>
-            </w:r>
-            <w:r>
-              <w:rPr>
-                <w:b/>
-              </w:rPr>
-              <w:t>05/2021</w:t>
+              <w:t>07/2022 - 07/2023</w:t>
             </w:r>
           </w:p>
         </w:tc>
@@ -489,45 +314,22 @@
             <w:tcW w:w="4000" w:type="pct"/>
           </w:tcPr>
           <w:p>
-            <w:proofErr w:type="spellStart"/>
             <w:r>
               <w:rPr>
+                <w:rFonts w:ascii="Arial" w:hAnsi="Arial" w:eastAsia="Arial"/>
                 <w:b/>
               </w:rPr>
-              <w:t>Remotly</w:t>
+              <w:t>LI.FI - Backend Developer</w:t>
             </w:r>
-            <w:proofErr w:type="spellEnd"/>
             <w:r>
-              <w:rPr>
-                <w:b/>
-              </w:rPr>
-              <w:t xml:space="preserve"> GmbH </w:t>
+              <w:br/>
             </w:r>
             <w:r>
               <w:rPr>
-                <w:b/>
+                <w:rFonts w:ascii="Arial" w:hAnsi="Arial" w:eastAsia="Arial"/>
+                <w:b w:val="0"/>
               </w:rPr>
-              <w:t>–</w:t>
-            </w:r>
-            <w:r>
-              <w:rPr>
-                <w:b/>
-              </w:rPr>
-              <w:t xml:space="preserve"> </w:t>
-            </w:r>
-            <w:proofErr w:type="spellStart"/>
-            <w:r>
-              <w:rPr>
-                <w:b/>
-              </w:rPr>
-              <w:t>Fullstack</w:t>
-            </w:r>
-            <w:proofErr w:type="spellEnd"/>
-            <w:r>
-              <w:rPr>
-                <w:b/>
-              </w:rPr>
-              <w:t xml:space="preserve"> Developer</w:t>
+              <w:t>Development of data connectors for on-chain data</w:t>
             </w:r>
           </w:p>
         </w:tc>
@@ -540,21 +342,10 @@
           <w:p>
             <w:r>
               <w:rPr>
+                <w:rFonts w:ascii="Arial" w:hAnsi="Arial" w:eastAsia="Arial"/>
                 <w:b/>
               </w:rPr>
-              <w:t>01/2020</w:t>
-            </w:r>
-            <w:r>
-              <w:rPr>
-                <w:b/>
-              </w:rPr>
-              <w:t xml:space="preserve"> - </w:t>
-            </w:r>
-            <w:r>
-              <w:rPr>
-                <w:b/>
-              </w:rPr>
-              <w:t>07/2022</w:t>
+              <w:t>12/2020 - 05/2021</w:t>
             </w:r>
           </w:p>
         </w:tc>
@@ -565,35 +356,40 @@
           <w:p>
             <w:r>
               <w:rPr>
+                <w:rFonts w:ascii="Arial" w:hAnsi="Arial" w:eastAsia="Arial"/>
                 <w:b/>
               </w:rPr>
-              <w:t xml:space="preserve">Boehler IT Solutions </w:t>
+              <w:t>Remotly GmbH - Full-Stack Developer</w:t>
             </w:r>
+          </w:p>
+        </w:tc>
+      </w:tr>
+      <w:tr>
+        <w:tc>
+          <w:tcPr>
+            <w:tcW w:w="1000" w:type="pct"/>
+          </w:tcPr>
+          <w:p>
             <w:r>
               <w:rPr>
+                <w:rFonts w:ascii="Arial" w:hAnsi="Arial" w:eastAsia="Arial"/>
                 <w:b/>
               </w:rPr>
-              <w:t>-</w:t>
+              <w:t>01/2020 - 07/2022</w:t>
             </w:r>
+          </w:p>
+        </w:tc>
+        <w:tc>
+          <w:tcPr>
+            <w:tcW w:w="4000" w:type="pct"/>
+          </w:tcPr>
+          <w:p>
             <w:r>
               <w:rPr>
+                <w:rFonts w:ascii="Arial" w:hAnsi="Arial" w:eastAsia="Arial"/>
                 <w:b/>
               </w:rPr>
-              <w:t xml:space="preserve"> Freelance </w:t>
-            </w:r>
-            <w:proofErr w:type="spellStart"/>
-            <w:r>
-              <w:rPr>
-                <w:b/>
-              </w:rPr>
-              <w:t>Fullstack</w:t>
-            </w:r>
-            <w:proofErr w:type="spellEnd"/>
-            <w:r>
-              <w:rPr>
-                <w:b/>
-              </w:rPr>
-              <w:t xml:space="preserve"> Developer</w:t>
+              <w:t>Boehler IT Solutions - Freelance Full-Stack Developer</w:t>
             </w:r>
           </w:p>
         </w:tc>
@@ -603,10 +399,11 @@
     <w:p>
       <w:r>
         <w:rPr>
+          <w:rFonts w:ascii="Arial" w:hAnsi="Arial" w:eastAsia="Arial"/>
           <w:b/>
           <w:sz w:val="22"/>
         </w:rPr>
-        <w:t>Gesellschaftliches Engagement</w:t>
+        <w:t>Civic Engagement</w:t>
       </w:r>
     </w:p>
     <w:tbl>
@@ -634,21 +431,10 @@
           <w:p>
             <w:r>
               <w:rPr>
+                <w:rFonts w:ascii="Arial" w:hAnsi="Arial" w:eastAsia="Arial"/>
                 <w:b/>
               </w:rPr>
-              <w:t>05/2018</w:t>
-            </w:r>
-            <w:r>
-              <w:rPr>
-                <w:b/>
-              </w:rPr>
-              <w:t xml:space="preserve"> - </w:t>
-            </w:r>
-            <w:r>
-              <w:rPr>
-                <w:b/>
-              </w:rPr>
-              <w:t>09/2022</w:t>
+              <w:t>05/2018 - 09/2022</w:t>
             </w:r>
           </w:p>
         </w:tc>
@@ -659,15 +445,20 @@
           <w:p>
             <w:r>
               <w:rPr>
+                <w:rFonts w:ascii="Arial" w:hAnsi="Arial" w:eastAsia="Arial"/>
                 <w:b/>
               </w:rPr>
-              <w:t>Jugendgemeinderat Stadt Filderstadt (2 Amtsperioden)</w:t>
+              <w:t>Youth Council, City of Filderstadt (2 terms)</w:t>
             </w:r>
             <w:r>
               <w:br/>
             </w:r>
             <w:r>
-              <w:t>Participated in a youth council for 2 consecutive periods.</w:t>
+              <w:rPr>
+                <w:rFonts w:ascii="Arial" w:hAnsi="Arial" w:eastAsia="Arial"/>
+                <w:b w:val="0"/>
+              </w:rPr>
+              <w:t>Participated in a youth council for two consecutive terms.</w:t>
             </w:r>
           </w:p>
         </w:tc>
@@ -680,21 +471,10 @@
           <w:p>
             <w:r>
               <w:rPr>
+                <w:rFonts w:ascii="Arial" w:hAnsi="Arial" w:eastAsia="Arial"/>
                 <w:b/>
               </w:rPr>
-              <w:t>2018</w:t>
-            </w:r>
-            <w:r>
-              <w:rPr>
-                <w:b/>
-              </w:rPr>
-              <w:t xml:space="preserve"> - </w:t>
-            </w:r>
-            <w:r>
-              <w:rPr>
-                <w:b/>
-              </w:rPr>
-              <w:t>2019</w:t>
+              <w:t>2018 - 2019</w:t>
             </w:r>
           </w:p>
         </w:tc>
@@ -705,15 +485,10 @@
           <w:p>
             <w:r>
               <w:rPr>
+                <w:rFonts w:ascii="Arial" w:hAnsi="Arial" w:eastAsia="Arial"/>
                 <w:b/>
               </w:rPr>
-              <w:t>Tennistrainer (</w:t>
-            </w:r>
-            <w:r>
-              <w:rPr>
-                <w:b/>
-              </w:rPr>
-              <w:t>Kids training)</w:t>
+              <w:t>Tennis Coach (Children's Training)</w:t>
             </w:r>
           </w:p>
         </w:tc>
@@ -731,10 +506,9 @@
       </w:pPr>
       <w:r>
         <w:rPr>
+          <w:rFonts w:ascii="Arial" w:hAnsi="Arial" w:eastAsia="Arial"/>
           <w:b/>
-          <w:bCs/>
           <w:sz w:val="22"/>
-          <w:szCs w:val="28"/>
         </w:rPr>
         <w:t>Research</w:t>
       </w:r>
@@ -764,6 +538,7 @@
           <w:p>
             <w:r>
               <w:rPr>
+                <w:rFonts w:ascii="Arial" w:hAnsi="Arial" w:eastAsia="Arial"/>
                 <w:b/>
               </w:rPr>
               <w:t>05/2026</w:t>
@@ -775,29 +550,20 @@
             <w:tcW w:w="4000" w:type="pct"/>
           </w:tcPr>
           <w:p>
-            <w:proofErr w:type="spellStart"/>
             <w:r>
               <w:rPr>
+                <w:rFonts w:ascii="Arial" w:hAnsi="Arial" w:eastAsia="Arial"/>
                 <w:b/>
               </w:rPr>
-              <w:t>QLoRA</w:t>
-            </w:r>
-            <w:proofErr w:type="spellEnd"/>
-            <w:r>
-              <w:rPr>
-                <w:b/>
-              </w:rPr>
-              <w:t xml:space="preserve"> Fine-Tuning for Next User Turn Prediction and Reference-Assisted Multi-Step Rollout Evaluation</w:t>
+              <w:t>QLoRA Fine-Tuning for Next User Turn Prediction and Reference-Assisted Multi-Step Rollout Evaluation</w:t>
             </w:r>
             <w:r>
-              <w:rPr>
-                <w:b/>
-              </w:rPr>
               <w:br/>
             </w:r>
             <w:r>
               <w:rPr>
-                <w:bCs/>
+                <w:rFonts w:ascii="Arial" w:hAnsi="Arial" w:eastAsia="Arial"/>
+                <w:b w:val="0"/>
               </w:rPr>
               <w:t>ICETSIS 2026, Bahrain</w:t>
             </w:r>
@@ -879,9 +645,10 @@
     </w:pPr>
     <w:r>
       <w:rPr>
-        <w:lang w:val="de-DE"/>
-      </w:rPr>
-      <w:t>Filderstadt, 20.02.2026</w:t>
+        <w:rFonts w:ascii="Arial" w:hAnsi="Arial" w:eastAsia="Arial"/>
+        <w:b w:val="0"/>
+      </w:rPr>
+      <w:t>Filderstadt, 20 February 2026</w:t>
     </w:r>
   </w:p>
 </w:hdr>

</xml_diff>

<commit_message>
docs(profile): publish IEEE paper and refresh stats
</commit_message>
<xml_diff>
--- a/public/sebastian_boehler_cv.docx
+++ b/public/sebastian_boehler_cv.docx
@@ -555,7 +555,7 @@
                 <w:rFonts w:ascii="Arial" w:hAnsi="Arial" w:eastAsia="Arial"/>
                 <w:b/>
               </w:rPr>
-              <w:t>QLoRA Fine-Tuning for Next User Turn Prediction and Reference-Assisted Multi-Step Rollout Evaluation</w:t>
+              <w:t>QLoRA Fine-Tuning for Next User Turn Prediction and Multi-Step Dialogue Rollouts</w:t>
             </w:r>
             <w:r>
               <w:br/>
@@ -565,7 +565,7 @@
                 <w:rFonts w:ascii="Arial" w:hAnsi="Arial" w:eastAsia="Arial"/>
                 <w:b w:val="0"/>
               </w:rPr>
-              <w:t>ICETSIS 2026, Bahrain</w:t>
+              <w:t>IEEE ICETSIS 2026, Manama, Bahrain, pp. 1548-1555. DOI: 10.1109/ICETSIS68266.2026.11549360</w:t>
             </w:r>
           </w:p>
         </w:tc>

</xml_diff>